<commit_message>
Redraw publication figures from saved data with editable vectors and 600 dpi TIFF
</commit_message>
<xml_diff>
--- a/manuscript/bmt_component_revision_20261029/BMT_Manuscript_Reading.docx
+++ b/manuscript/bmt_component_revision_20261029/BMT_Manuscript_Reading.docx
@@ -2418,7 +2418,7 @@
       <w:r>
         <w:drawing>
           <wp:inline>
-            <wp:extent cx="5334000" cy="3374345"/>
+            <wp:extent cx="5334000" cy="3891229"/>
             <wp:effectExtent b="0" l="0" r="0" t="0"/>
             <wp:docPr descr="Figure 1" title="" id="31" name="Picture"/>
             <a:graphic>
@@ -2439,7 +2439,7 @@
                   <pic:spPr bwMode="auto">
                     <a:xfrm>
                       <a:off x="0" y="0"/>
-                      <a:ext cx="5334000" cy="3374345"/>
+                      <a:ext cx="5334000" cy="3891229"/>
                     </a:xfrm>
                     <a:prstGeom prst="rect">
                       <a:avLst/>
@@ -2544,7 +2544,7 @@
       <w:r>
         <w:drawing>
           <wp:inline>
-            <wp:extent cx="5334000" cy="4077758"/>
+            <wp:extent cx="5334000" cy="4550174"/>
             <wp:effectExtent b="0" l="0" r="0" t="0"/>
             <wp:docPr descr="Figure 2" title="" id="36" name="Picture"/>
             <a:graphic>
@@ -2565,7 +2565,7 @@
                   <pic:spPr bwMode="auto">
                     <a:xfrm>
                       <a:off x="0" y="0"/>
-                      <a:ext cx="5334000" cy="4077758"/>
+                      <a:ext cx="5334000" cy="4550174"/>
                     </a:xfrm>
                     <a:prstGeom prst="rect">
                       <a:avLst/>
@@ -2618,7 +2618,7 @@
       <w:r>
         <w:drawing>
           <wp:inline>
-            <wp:extent cx="5334000" cy="4436650"/>
+            <wp:extent cx="5334000" cy="4550174"/>
             <wp:effectExtent b="0" l="0" r="0" t="0"/>
             <wp:docPr descr="Figure 3" title="" id="39" name="Picture"/>
             <a:graphic>
@@ -2639,7 +2639,7 @@
                   <pic:spPr bwMode="auto">
                     <a:xfrm>
                       <a:off x="0" y="0"/>
-                      <a:ext cx="5334000" cy="4436650"/>
+                      <a:ext cx="5334000" cy="4550174"/>
                     </a:xfrm>
                     <a:prstGeom prst="rect">
                       <a:avLst/>
@@ -2674,7 +2674,7 @@
         <w:t xml:space="preserve"> </w:t>
       </w:r>
       <w:r>
-        <w:t xml:space="preserve">A: participant BA and cohort means for four fixed decoders. B: paired participant differences and pointwise 95% bootstrap intervals for the primary full-minus-LDA-only and secondary EA-minus-full contrasts. C–D: participant-by-query-run differences across five complete test runs. Nine participants contributed 120 query trials each. Alignment references used source and current-support signals.</w:t>
+        <w:t xml:space="preserve">A: participant BA; cohort means appear beneath the method names. B: paired participant differences and pointwise 95% bootstrap intervals for the primary full-minus-LDA-only and secondary EA-minus-full contrasts. C–D: participant-by-query-run differences across five complete test runs. Nine participants contributed 120 query trials each. Alignment references used source and current-support signals.</w:t>
       </w:r>
     </w:p>
     <w:bookmarkEnd w:id="41"/>

</xml_diff>